<commit_message>
Agregado el ejemplo de ejecucion
</commit_message>
<xml_diff>
--- a/docs/documento.docx
+++ b/docs/documento.docx
@@ -153,29 +153,7 @@
           <w:szCs w:val="28"/>
           <w:lang w:val="es-MX"/>
         </w:rPr>
-        <w:t xml:space="preserve">M.A. </w:t>
-      </w:r>
-      <w:proofErr w:type="spellStart"/>
-      <w:r>
-        <w:rPr>
-          <w:b/>
-          <w:bCs/>
-          <w:sz w:val="28"/>
-          <w:szCs w:val="28"/>
-          <w:lang w:val="es-MX"/>
-        </w:rPr>
-        <w:t>Maria</w:t>
-      </w:r>
-      <w:proofErr w:type="spellEnd"/>
-      <w:r>
-        <w:rPr>
-          <w:b/>
-          <w:bCs/>
-          <w:sz w:val="28"/>
-          <w:szCs w:val="28"/>
-          <w:lang w:val="es-MX"/>
-        </w:rPr>
-        <w:t xml:space="preserve"> Del Carmen Martínez Cejudo</w:t>
+        <w:t>M.A. Maria Del Carmen Martínez Cejudo</w:t>
       </w:r>
     </w:p>
     <w:p>
@@ -508,7 +486,6 @@
           <w:lang w:val="es-MX"/>
         </w:rPr>
       </w:pPr>
-      <w:proofErr w:type="spellStart"/>
       <w:r>
         <w:rPr>
           <w:rFonts w:cstheme="minorHAnsi"/>
@@ -520,21 +497,7 @@
           <w:szCs w:val="28"/>
           <w:lang w:val="es-MX"/>
         </w:rPr>
-        <w:t>evaluar_polimonio</w:t>
-      </w:r>
-      <w:proofErr w:type="spellEnd"/>
-      <w:r>
-        <w:rPr>
-          <w:rFonts w:cstheme="minorHAnsi"/>
-          <w:b/>
-          <w:bCs/>
-          <w:i/>
-          <w:iCs/>
-          <w:sz w:val="28"/>
-          <w:szCs w:val="28"/>
-          <w:lang w:val="es-MX"/>
-        </w:rPr>
-        <w:t>(coeficientes, x)</w:t>
+        <w:t>evaluar_polimonio(coeficientes, x)</w:t>
       </w:r>
     </w:p>
     <w:p>
@@ -752,7 +715,6 @@
           <w:lang w:val="es-MX"/>
         </w:rPr>
       </w:pPr>
-      <w:proofErr w:type="spellStart"/>
       <w:r>
         <w:rPr>
           <w:rFonts w:cstheme="minorHAnsi"/>
@@ -763,91 +725,7 @@
           <w:lang w:val="es-MX"/>
         </w:rPr>
         <w:lastRenderedPageBreak/>
-        <w:t>biseccion</w:t>
-      </w:r>
-      <w:proofErr w:type="spellEnd"/>
-      <w:r>
-        <w:rPr>
-          <w:rFonts w:cstheme="minorHAnsi"/>
-          <w:b/>
-          <w:bCs/>
-          <w:sz w:val="28"/>
-          <w:szCs w:val="28"/>
-          <w:lang w:val="es-MX"/>
-        </w:rPr>
-        <w:t xml:space="preserve">(coeficientes, </w:t>
-      </w:r>
-      <w:proofErr w:type="spellStart"/>
-      <w:r>
-        <w:rPr>
-          <w:rFonts w:cstheme="minorHAnsi"/>
-          <w:b/>
-          <w:bCs/>
-          <w:sz w:val="28"/>
-          <w:szCs w:val="28"/>
-          <w:lang w:val="es-MX"/>
-        </w:rPr>
-        <w:t>lim_izq</w:t>
-      </w:r>
-      <w:proofErr w:type="spellEnd"/>
-      <w:r>
-        <w:rPr>
-          <w:rFonts w:cstheme="minorHAnsi"/>
-          <w:b/>
-          <w:bCs/>
-          <w:sz w:val="28"/>
-          <w:szCs w:val="28"/>
-          <w:lang w:val="es-MX"/>
-        </w:rPr>
-        <w:t xml:space="preserve">, </w:t>
-      </w:r>
-      <w:proofErr w:type="spellStart"/>
-      <w:r>
-        <w:rPr>
-          <w:rFonts w:cstheme="minorHAnsi"/>
-          <w:b/>
-          <w:bCs/>
-          <w:sz w:val="28"/>
-          <w:szCs w:val="28"/>
-          <w:lang w:val="es-MX"/>
-        </w:rPr>
-        <w:t>lim_der</w:t>
-      </w:r>
-      <w:proofErr w:type="spellEnd"/>
-      <w:r>
-        <w:rPr>
-          <w:rFonts w:cstheme="minorHAnsi"/>
-          <w:b/>
-          <w:bCs/>
-          <w:sz w:val="28"/>
-          <w:szCs w:val="28"/>
-          <w:lang w:val="es-MX"/>
-        </w:rPr>
-        <w:t xml:space="preserve">, tolerancia=1e-6, </w:t>
-      </w:r>
-      <w:proofErr w:type="spellStart"/>
-      <w:r>
-        <w:rPr>
-          <w:rFonts w:cstheme="minorHAnsi"/>
-          <w:b/>
-          <w:bCs/>
-          <w:sz w:val="28"/>
-          <w:szCs w:val="28"/>
-          <w:lang w:val="es-MX"/>
-        </w:rPr>
-        <w:t>max_iter</w:t>
-      </w:r>
-      <w:proofErr w:type="spellEnd"/>
-      <w:r>
-        <w:rPr>
-          <w:rFonts w:cstheme="minorHAnsi"/>
-          <w:b/>
-          <w:bCs/>
-          <w:sz w:val="28"/>
-          <w:szCs w:val="28"/>
-          <w:lang w:val="es-MX"/>
-        </w:rPr>
-        <w:t>=100)</w:t>
+        <w:t>biseccion(coeficientes, lim_izq, lim_der, tolerancia=1e-6, max_iter=100)</w:t>
       </w:r>
     </w:p>
     <w:p>
@@ -957,47 +835,7 @@
           <w:lang w:val="es-MX"/>
         </w:rPr>
         <w:br/>
-        <w:t xml:space="preserve">Esta es la función principal del método. Primero evalúa el polinomio en los extremos </w:t>
-      </w:r>
-      <w:proofErr w:type="spellStart"/>
-      <w:r>
-        <w:rPr>
-          <w:rFonts w:cstheme="minorHAnsi"/>
-          <w:sz w:val="24"/>
-          <w:szCs w:val="24"/>
-          <w:lang w:val="es-MX"/>
-        </w:rPr>
-        <w:t>lim_izq</w:t>
-      </w:r>
-      <w:proofErr w:type="spellEnd"/>
-      <w:r>
-        <w:rPr>
-          <w:rFonts w:cstheme="minorHAnsi"/>
-          <w:sz w:val="24"/>
-          <w:szCs w:val="24"/>
-          <w:lang w:val="es-MX"/>
-        </w:rPr>
-        <w:t xml:space="preserve"> y </w:t>
-      </w:r>
-      <w:proofErr w:type="spellStart"/>
-      <w:r>
-        <w:rPr>
-          <w:rFonts w:cstheme="minorHAnsi"/>
-          <w:sz w:val="24"/>
-          <w:szCs w:val="24"/>
-          <w:lang w:val="es-MX"/>
-        </w:rPr>
-        <w:t>lim_der</w:t>
-      </w:r>
-      <w:proofErr w:type="spellEnd"/>
-      <w:r>
-        <w:rPr>
-          <w:rFonts w:cstheme="minorHAnsi"/>
-          <w:sz w:val="24"/>
-          <w:szCs w:val="24"/>
-          <w:lang w:val="es-MX"/>
-        </w:rPr>
-        <w:t xml:space="preserve">. Si el producto </w:t>
+        <w:t xml:space="preserve">Esta es la función principal del método. Primero evalúa el polinomio en los extremos lim_izq y lim_der. Si el producto </w:t>
       </w:r>
       <w:r>
         <w:rPr>
@@ -1008,104 +846,16 @@
           <w:szCs w:val="24"/>
           <w:lang w:val="es-MX"/>
         </w:rPr>
-        <w:t>f(</w:t>
-      </w:r>
-      <w:proofErr w:type="spellStart"/>
-      <w:r>
-        <w:rPr>
-          <w:rFonts w:cstheme="minorHAnsi"/>
-          <w:i/>
-          <w:iCs/>
-          <w:sz w:val="24"/>
-          <w:szCs w:val="24"/>
-          <w:lang w:val="es-MX"/>
-        </w:rPr>
-        <w:t>lim_izq</w:t>
-      </w:r>
-      <w:proofErr w:type="spellEnd"/>
-      <w:r>
-        <w:rPr>
-          <w:rFonts w:cstheme="minorHAnsi"/>
-          <w:i/>
-          <w:iCs/>
-          <w:sz w:val="24"/>
-          <w:szCs w:val="24"/>
-          <w:lang w:val="es-MX"/>
-        </w:rPr>
-        <w:t>) * f(</w:t>
-      </w:r>
-      <w:proofErr w:type="spellStart"/>
-      <w:r>
-        <w:rPr>
-          <w:rFonts w:cstheme="minorHAnsi"/>
-          <w:i/>
-          <w:iCs/>
-          <w:sz w:val="24"/>
-          <w:szCs w:val="24"/>
-          <w:lang w:val="es-MX"/>
-        </w:rPr>
-        <w:t>lim_der</w:t>
-      </w:r>
-      <w:proofErr w:type="spellEnd"/>
-      <w:r>
-        <w:rPr>
-          <w:rFonts w:cstheme="minorHAnsi"/>
-          <w:i/>
-          <w:iCs/>
-          <w:sz w:val="24"/>
-          <w:szCs w:val="24"/>
-          <w:lang w:val="es-MX"/>
-        </w:rPr>
-        <w:t>) &gt;= 0</w:t>
-      </w:r>
-      <w:r>
-        <w:rPr>
-          <w:rFonts w:cstheme="minorHAnsi"/>
-          <w:sz w:val="24"/>
-          <w:szCs w:val="24"/>
-          <w:lang w:val="es-MX"/>
-        </w:rPr>
-        <w:t xml:space="preserve">, lanza una excepción </w:t>
-      </w:r>
-      <w:proofErr w:type="spellStart"/>
-      <w:r>
-        <w:rPr>
-          <w:rFonts w:cstheme="minorHAnsi"/>
-          <w:sz w:val="24"/>
-          <w:szCs w:val="24"/>
-          <w:lang w:val="es-MX"/>
-        </w:rPr>
-        <w:t>ValueError</w:t>
-      </w:r>
-      <w:proofErr w:type="spellEnd"/>
-      <w:r>
-        <w:rPr>
-          <w:rFonts w:cstheme="minorHAnsi"/>
-          <w:sz w:val="24"/>
-          <w:szCs w:val="24"/>
-          <w:lang w:val="es-MX"/>
-        </w:rPr>
-        <w:t xml:space="preserve"> indicando que no hay cambio de signo y que no se puede aplicar bisección. Si hay cambio de signo, inicializa una lista historial y comienza un ciclo de hasta </w:t>
-      </w:r>
-      <w:proofErr w:type="spellStart"/>
-      <w:r>
-        <w:rPr>
-          <w:rFonts w:cstheme="minorHAnsi"/>
-          <w:sz w:val="24"/>
-          <w:szCs w:val="24"/>
-          <w:lang w:val="es-MX"/>
-        </w:rPr>
-        <w:t>max_iter</w:t>
-      </w:r>
-      <w:proofErr w:type="spellEnd"/>
-      <w:r>
-        <w:rPr>
-          <w:rFonts w:cstheme="minorHAnsi"/>
-          <w:sz w:val="24"/>
-          <w:szCs w:val="24"/>
-          <w:lang w:val="es-MX"/>
-        </w:rPr>
-        <w:t xml:space="preserve"> iteraciones. En cada iteración:</w:t>
+        <w:t>f(lim_izq) * f(lim_der) &gt;= 0</w:t>
+      </w:r>
+      <w:r>
+        <w:rPr>
+          <w:rFonts w:cstheme="minorHAnsi"/>
+          <w:sz w:val="24"/>
+          <w:szCs w:val="24"/>
+          <w:lang w:val="es-MX"/>
+        </w:rPr>
+        <w:t>, lanza una excepción ValueError indicando que no hay cambio de signo y que no se puede aplicar bisección. Si hay cambio de signo, inicializa una lista historial y comienza un ciclo de hasta max_iter iteraciones. En cada iteración:</w:t>
       </w:r>
     </w:p>
     <w:p>
@@ -1134,79 +884,7 @@
           <w:lang w:val="es-MX"/>
         </w:rPr>
         <w:lastRenderedPageBreak/>
-        <w:t xml:space="preserve">Calcula el punto medio </w:t>
-      </w:r>
-      <w:proofErr w:type="spellStart"/>
-      <w:r>
-        <w:rPr>
-          <w:rFonts w:cstheme="minorHAnsi"/>
-          <w:i/>
-          <w:iCs/>
-          <w:sz w:val="24"/>
-          <w:szCs w:val="24"/>
-          <w:lang w:val="es-MX"/>
-        </w:rPr>
-        <w:t>punto_medio</w:t>
-      </w:r>
-      <w:proofErr w:type="spellEnd"/>
-      <w:r>
-        <w:rPr>
-          <w:rFonts w:cstheme="minorHAnsi"/>
-          <w:i/>
-          <w:iCs/>
-          <w:sz w:val="24"/>
-          <w:szCs w:val="24"/>
-          <w:lang w:val="es-MX"/>
-        </w:rPr>
-        <w:t xml:space="preserve"> = (</w:t>
-      </w:r>
-      <w:proofErr w:type="spellStart"/>
-      <w:r>
-        <w:rPr>
-          <w:rFonts w:cstheme="minorHAnsi"/>
-          <w:i/>
-          <w:iCs/>
-          <w:sz w:val="24"/>
-          <w:szCs w:val="24"/>
-          <w:lang w:val="es-MX"/>
-        </w:rPr>
-        <w:t>lim_izq</w:t>
-      </w:r>
-      <w:proofErr w:type="spellEnd"/>
-      <w:r>
-        <w:rPr>
-          <w:rFonts w:cstheme="minorHAnsi"/>
-          <w:i/>
-          <w:iCs/>
-          <w:sz w:val="24"/>
-          <w:szCs w:val="24"/>
-          <w:lang w:val="es-MX"/>
-        </w:rPr>
-        <w:t xml:space="preserve"> + </w:t>
-      </w:r>
-      <w:proofErr w:type="spellStart"/>
-      <w:r>
-        <w:rPr>
-          <w:rFonts w:cstheme="minorHAnsi"/>
-          <w:i/>
-          <w:iCs/>
-          <w:sz w:val="24"/>
-          <w:szCs w:val="24"/>
-          <w:lang w:val="es-MX"/>
-        </w:rPr>
-        <w:t>lim_der</w:t>
-      </w:r>
-      <w:proofErr w:type="spellEnd"/>
-      <w:r>
-        <w:rPr>
-          <w:rFonts w:cstheme="minorHAnsi"/>
-          <w:i/>
-          <w:iCs/>
-          <w:sz w:val="24"/>
-          <w:szCs w:val="24"/>
-          <w:lang w:val="es-MX"/>
-        </w:rPr>
-        <w:t>) / 2.</w:t>
+        <w:t>Calcula el punto medio punto_medio = (lim_izq + lim_der) / 2.</w:t>
       </w:r>
     </w:p>
     <w:p>
@@ -1234,31 +912,7 @@
           <w:szCs w:val="24"/>
           <w:lang w:val="es-MX"/>
         </w:rPr>
-        <w:t>Evalúa f(</w:t>
-      </w:r>
-      <w:proofErr w:type="spellStart"/>
-      <w:r>
-        <w:rPr>
-          <w:rFonts w:cstheme="minorHAnsi"/>
-          <w:i/>
-          <w:iCs/>
-          <w:sz w:val="24"/>
-          <w:szCs w:val="24"/>
-          <w:lang w:val="es-MX"/>
-        </w:rPr>
-        <w:t>punto_medio</w:t>
-      </w:r>
-      <w:proofErr w:type="spellEnd"/>
-      <w:r>
-        <w:rPr>
-          <w:rFonts w:cstheme="minorHAnsi"/>
-          <w:i/>
-          <w:iCs/>
-          <w:sz w:val="24"/>
-          <w:szCs w:val="24"/>
-          <w:lang w:val="es-MX"/>
-        </w:rPr>
-        <w:t>).</w:t>
+        <w:t>Evalúa f(punto_medio).</w:t>
       </w:r>
     </w:p>
     <w:p>
@@ -1314,103 +968,7 @@
           <w:szCs w:val="24"/>
           <w:lang w:val="es-MX"/>
         </w:rPr>
-        <w:t xml:space="preserve">Verifica el criterio de parada: si </w:t>
-      </w:r>
-      <w:proofErr w:type="spellStart"/>
-      <w:r>
-        <w:rPr>
-          <w:rFonts w:cstheme="minorHAnsi"/>
-          <w:i/>
-          <w:iCs/>
-          <w:sz w:val="24"/>
-          <w:szCs w:val="24"/>
-          <w:lang w:val="es-MX"/>
-        </w:rPr>
-        <w:t>abs</w:t>
-      </w:r>
-      <w:proofErr w:type="spellEnd"/>
-      <w:r>
-        <w:rPr>
-          <w:rFonts w:cstheme="minorHAnsi"/>
-          <w:i/>
-          <w:iCs/>
-          <w:sz w:val="24"/>
-          <w:szCs w:val="24"/>
-          <w:lang w:val="es-MX"/>
-        </w:rPr>
-        <w:t>(f(</w:t>
-      </w:r>
-      <w:proofErr w:type="spellStart"/>
-      <w:r>
-        <w:rPr>
-          <w:rFonts w:cstheme="minorHAnsi"/>
-          <w:i/>
-          <w:iCs/>
-          <w:sz w:val="24"/>
-          <w:szCs w:val="24"/>
-          <w:lang w:val="es-MX"/>
-        </w:rPr>
-        <w:t>punto_medio</w:t>
-      </w:r>
-      <w:proofErr w:type="spellEnd"/>
-      <w:r>
-        <w:rPr>
-          <w:rFonts w:cstheme="minorHAnsi"/>
-          <w:i/>
-          <w:iCs/>
-          <w:sz w:val="24"/>
-          <w:szCs w:val="24"/>
-          <w:lang w:val="es-MX"/>
-        </w:rPr>
-        <w:t>)) &lt;= tolerancia o si la mitad del ancho del intervalo (</w:t>
-      </w:r>
-      <w:proofErr w:type="spellStart"/>
-      <w:r>
-        <w:rPr>
-          <w:rFonts w:cstheme="minorHAnsi"/>
-          <w:i/>
-          <w:iCs/>
-          <w:sz w:val="24"/>
-          <w:szCs w:val="24"/>
-          <w:lang w:val="es-MX"/>
-        </w:rPr>
-        <w:t>lim_der</w:t>
-      </w:r>
-      <w:proofErr w:type="spellEnd"/>
-      <w:r>
-        <w:rPr>
-          <w:rFonts w:cstheme="minorHAnsi"/>
-          <w:i/>
-          <w:iCs/>
-          <w:sz w:val="24"/>
-          <w:szCs w:val="24"/>
-          <w:lang w:val="es-MX"/>
-        </w:rPr>
-        <w:t xml:space="preserve"> - </w:t>
-      </w:r>
-      <w:proofErr w:type="spellStart"/>
-      <w:r>
-        <w:rPr>
-          <w:rFonts w:cstheme="minorHAnsi"/>
-          <w:i/>
-          <w:iCs/>
-          <w:sz w:val="24"/>
-          <w:szCs w:val="24"/>
-          <w:lang w:val="es-MX"/>
-        </w:rPr>
-        <w:t>lim_izq</w:t>
-      </w:r>
-      <w:proofErr w:type="spellEnd"/>
-      <w:r>
-        <w:rPr>
-          <w:rFonts w:cstheme="minorHAnsi"/>
-          <w:i/>
-          <w:iCs/>
-          <w:sz w:val="24"/>
-          <w:szCs w:val="24"/>
-          <w:lang w:val="es-MX"/>
-        </w:rPr>
-        <w:t>) / 2 &lt;= tolerancia, devuelve el punto medio, el número de iteraciones realizadas (índice i) y el historial.</w:t>
+        <w:t>Verifica el criterio de parada: si abs(f(punto_medio)) &lt;= tolerancia o si la mitad del ancho del intervalo (lim_der - lim_izq) / 2 &lt;= tolerancia, devuelve el punto medio, el número de iteraciones realizadas (índice i) y el historial.</w:t>
       </w:r>
     </w:p>
     <w:p>
@@ -1438,191 +996,27 @@
           <w:szCs w:val="24"/>
           <w:lang w:val="es-MX"/>
         </w:rPr>
-        <w:t>Si no se cumple el criterio, decide si la raíz está en [</w:t>
-      </w:r>
-      <w:proofErr w:type="spellStart"/>
-      <w:r>
-        <w:rPr>
-          <w:rFonts w:cstheme="minorHAnsi"/>
-          <w:i/>
-          <w:iCs/>
-          <w:sz w:val="24"/>
-          <w:szCs w:val="24"/>
-          <w:lang w:val="es-MX"/>
-        </w:rPr>
-        <w:t>lim_izq</w:t>
-      </w:r>
-      <w:proofErr w:type="spellEnd"/>
-      <w:r>
-        <w:rPr>
-          <w:rFonts w:cstheme="minorHAnsi"/>
-          <w:i/>
-          <w:iCs/>
-          <w:sz w:val="24"/>
-          <w:szCs w:val="24"/>
-          <w:lang w:val="es-MX"/>
-        </w:rPr>
-        <w:t xml:space="preserve">, </w:t>
-      </w:r>
-      <w:proofErr w:type="spellStart"/>
-      <w:r>
-        <w:rPr>
-          <w:rFonts w:cstheme="minorHAnsi"/>
-          <w:i/>
-          <w:iCs/>
-          <w:sz w:val="24"/>
-          <w:szCs w:val="24"/>
-          <w:lang w:val="es-MX"/>
-        </w:rPr>
-        <w:t>punto_medio</w:t>
-      </w:r>
-      <w:proofErr w:type="spellEnd"/>
-      <w:r>
-        <w:rPr>
-          <w:rFonts w:cstheme="minorHAnsi"/>
-          <w:i/>
-          <w:iCs/>
-          <w:sz w:val="24"/>
-          <w:szCs w:val="24"/>
-          <w:lang w:val="es-MX"/>
-        </w:rPr>
-        <w:t>] o en [</w:t>
-      </w:r>
-      <w:proofErr w:type="spellStart"/>
-      <w:r>
-        <w:rPr>
-          <w:rFonts w:cstheme="minorHAnsi"/>
-          <w:i/>
-          <w:iCs/>
-          <w:sz w:val="24"/>
-          <w:szCs w:val="24"/>
-          <w:lang w:val="es-MX"/>
-        </w:rPr>
-        <w:t>punto_medio</w:t>
-      </w:r>
-      <w:proofErr w:type="spellEnd"/>
-      <w:r>
-        <w:rPr>
-          <w:rFonts w:cstheme="minorHAnsi"/>
-          <w:i/>
-          <w:iCs/>
-          <w:sz w:val="24"/>
-          <w:szCs w:val="24"/>
-          <w:lang w:val="es-MX"/>
-        </w:rPr>
-        <w:t xml:space="preserve">, </w:t>
-      </w:r>
-      <w:proofErr w:type="spellStart"/>
-      <w:r>
-        <w:rPr>
-          <w:rFonts w:cstheme="minorHAnsi"/>
-          <w:i/>
-          <w:iCs/>
-          <w:sz w:val="24"/>
-          <w:szCs w:val="24"/>
-          <w:lang w:val="es-MX"/>
-        </w:rPr>
-        <w:t>lim_der</w:t>
-      </w:r>
-      <w:proofErr w:type="spellEnd"/>
-      <w:r>
-        <w:rPr>
-          <w:rFonts w:cstheme="minorHAnsi"/>
-          <w:i/>
-          <w:iCs/>
-          <w:sz w:val="24"/>
-          <w:szCs w:val="24"/>
-          <w:lang w:val="es-MX"/>
-        </w:rPr>
-        <w:t>] según el signo de f(</w:t>
-      </w:r>
-      <w:proofErr w:type="spellStart"/>
-      <w:r>
-        <w:rPr>
-          <w:rFonts w:cstheme="minorHAnsi"/>
-          <w:i/>
-          <w:iCs/>
-          <w:sz w:val="24"/>
-          <w:szCs w:val="24"/>
-          <w:lang w:val="es-MX"/>
-        </w:rPr>
-        <w:t>lim_izq</w:t>
-      </w:r>
-      <w:proofErr w:type="spellEnd"/>
-      <w:r>
-        <w:rPr>
-          <w:rFonts w:cstheme="minorHAnsi"/>
-          <w:i/>
-          <w:iCs/>
-          <w:sz w:val="24"/>
-          <w:szCs w:val="24"/>
-          <w:lang w:val="es-MX"/>
-        </w:rPr>
-        <w:t>) * f(</w:t>
-      </w:r>
-      <w:proofErr w:type="spellStart"/>
-      <w:r>
-        <w:rPr>
-          <w:rFonts w:cstheme="minorHAnsi"/>
-          <w:i/>
-          <w:iCs/>
-          <w:sz w:val="24"/>
-          <w:szCs w:val="24"/>
-          <w:lang w:val="es-MX"/>
-        </w:rPr>
-        <w:t>punto_medio</w:t>
-      </w:r>
-      <w:proofErr w:type="spellEnd"/>
-      <w:r>
-        <w:rPr>
-          <w:rFonts w:cstheme="minorHAnsi"/>
-          <w:i/>
-          <w:iCs/>
-          <w:sz w:val="24"/>
-          <w:szCs w:val="24"/>
-          <w:lang w:val="es-MX"/>
-        </w:rPr>
-        <w:t>), y actualiza los límites y los valores de f correspondientes.</w:t>
-      </w:r>
-    </w:p>
-    <w:p>
-      <w:pPr>
-        <w:spacing w:after="120"/>
-        <w:rPr>
-          <w:rFonts w:cstheme="minorHAnsi"/>
-          <w:sz w:val="24"/>
-          <w:szCs w:val="24"/>
-          <w:lang w:val="es-MX"/>
-        </w:rPr>
-      </w:pPr>
-      <w:r>
-        <w:rPr>
-          <w:rFonts w:cstheme="minorHAnsi"/>
-          <w:sz w:val="24"/>
-          <w:szCs w:val="24"/>
-          <w:lang w:val="es-MX"/>
-        </w:rPr>
-        <w:t xml:space="preserve">Si se alcanza el número máximo de iteraciones sin cumplir la tolerancia, devuelve el último punto medio calculado, </w:t>
-      </w:r>
-      <w:proofErr w:type="spellStart"/>
-      <w:r>
-        <w:rPr>
-          <w:rFonts w:cstheme="minorHAnsi"/>
-          <w:sz w:val="24"/>
-          <w:szCs w:val="24"/>
-          <w:lang w:val="es-MX"/>
-        </w:rPr>
-        <w:t>max_iter</w:t>
-      </w:r>
-      <w:proofErr w:type="spellEnd"/>
-      <w:r>
-        <w:rPr>
-          <w:rFonts w:cstheme="minorHAnsi"/>
-          <w:sz w:val="24"/>
-          <w:szCs w:val="24"/>
-          <w:lang w:val="es-MX"/>
-        </w:rPr>
-        <w:t xml:space="preserve"> y el historial completo. Esta función garantiza que el intervalo siempre contenga una raíz y que el error se reduzca a la mitad en cada paso.</w:t>
+        <w:t>Si no se cumple el criterio, decide si la raíz está en [lim_izq, punto_medio] o en [punto_medio, lim_der] según el signo de f(lim_izq) * f(punto_medio), y actualiza los límites y los valores de f correspondientes.</w:t>
+      </w:r>
+    </w:p>
+    <w:p>
+      <w:pPr>
+        <w:spacing w:after="120"/>
+        <w:rPr>
+          <w:rFonts w:cstheme="minorHAnsi"/>
+          <w:sz w:val="24"/>
+          <w:szCs w:val="24"/>
+          <w:lang w:val="es-MX"/>
+        </w:rPr>
+      </w:pPr>
+      <w:r>
+        <w:rPr>
+          <w:rFonts w:cstheme="minorHAnsi"/>
+          <w:sz w:val="24"/>
+          <w:szCs w:val="24"/>
+          <w:lang w:val="es-MX"/>
+        </w:rPr>
+        <w:t>Si se alcanza el número máximo de iteraciones sin cumplir la tolerancia, devuelve el último punto medio calculado, max_iter y el historial completo. Esta función garantiza que el intervalo siempre contenga una raíz y que el error se reduzca a la mitad en cada paso.</w:t>
       </w:r>
     </w:p>
     <w:p>
@@ -1835,7 +1229,6 @@
           <w:lang w:val="es-MX"/>
         </w:rPr>
       </w:pPr>
-      <w:proofErr w:type="spellStart"/>
       <w:r>
         <w:rPr>
           <w:rFonts w:cstheme="minorHAnsi"/>
@@ -1846,19 +1239,7 @@
           <w:lang w:val="es-MX"/>
         </w:rPr>
         <w:lastRenderedPageBreak/>
-        <w:t>ejecutar_biseccion</w:t>
-      </w:r>
-      <w:proofErr w:type="spellEnd"/>
-      <w:r>
-        <w:rPr>
-          <w:rFonts w:cstheme="minorHAnsi"/>
-          <w:b/>
-          <w:bCs/>
-          <w:sz w:val="28"/>
-          <w:szCs w:val="28"/>
-          <w:lang w:val="es-MX"/>
-        </w:rPr>
-        <w:t>()</w:t>
+        <w:t>ejecutar_biseccion()</w:t>
       </w:r>
     </w:p>
     <w:p>
@@ -1958,7 +1339,6 @@
         <w:br/>
         <w:t xml:space="preserve">Esta función maneja la interacción con el usuario para el método de bisección. Muestra un mensaje explicativo, solicita los coeficientes del polinomio (separados por espacios, de mayor a menor grado), los límites izquierdo y derecho del intervalo, y la tolerancia. Valida que los coeficientes sean números reales y que al menos haya uno. También verifica que </w:t>
       </w:r>
-      <w:proofErr w:type="spellStart"/>
       <w:r>
         <w:rPr>
           <w:rFonts w:cstheme="minorHAnsi"/>
@@ -1968,101 +1348,16 @@
           <w:szCs w:val="24"/>
           <w:lang w:val="es-MX"/>
         </w:rPr>
-        <w:t>lim_izq</w:t>
-      </w:r>
-      <w:proofErr w:type="spellEnd"/>
-      <w:r>
-        <w:rPr>
-          <w:rFonts w:cstheme="minorHAnsi"/>
-          <w:i/>
-          <w:iCs/>
-          <w:sz w:val="24"/>
-          <w:szCs w:val="24"/>
-          <w:lang w:val="es-MX"/>
-        </w:rPr>
-        <w:t xml:space="preserve"> &lt; </w:t>
-      </w:r>
-      <w:proofErr w:type="spellStart"/>
-      <w:r>
-        <w:rPr>
-          <w:rFonts w:cstheme="minorHAnsi"/>
-          <w:i/>
-          <w:iCs/>
-          <w:sz w:val="24"/>
-          <w:szCs w:val="24"/>
-          <w:lang w:val="es-MX"/>
-        </w:rPr>
-        <w:t>lim_der</w:t>
-      </w:r>
-      <w:proofErr w:type="spellEnd"/>
-      <w:r>
-        <w:rPr>
-          <w:rFonts w:cstheme="minorHAnsi"/>
-          <w:sz w:val="24"/>
-          <w:szCs w:val="24"/>
-          <w:lang w:val="es-MX"/>
-        </w:rPr>
-        <w:t xml:space="preserve">. Luego llama a la función </w:t>
-      </w:r>
-      <w:proofErr w:type="spellStart"/>
-      <w:r>
-        <w:rPr>
-          <w:rFonts w:cstheme="minorHAnsi"/>
-          <w:sz w:val="24"/>
-          <w:szCs w:val="24"/>
-          <w:lang w:val="es-MX"/>
-        </w:rPr>
-        <w:t>biseccion</w:t>
-      </w:r>
-      <w:proofErr w:type="spellEnd"/>
-      <w:r>
-        <w:rPr>
-          <w:rFonts w:cstheme="minorHAnsi"/>
-          <w:sz w:val="24"/>
-          <w:szCs w:val="24"/>
-          <w:lang w:val="es-MX"/>
-        </w:rPr>
-        <w:t xml:space="preserve"> y, si no hay errores, muestra la raíz encontrada, el número de iteraciones y una tabla formateada con el historial de iteraciones (columnas: </w:t>
-      </w:r>
-      <w:proofErr w:type="spellStart"/>
-      <w:r>
-        <w:rPr>
-          <w:rFonts w:cstheme="minorHAnsi"/>
-          <w:sz w:val="24"/>
-          <w:szCs w:val="24"/>
-          <w:lang w:val="es-MX"/>
-        </w:rPr>
-        <w:t>Iter</w:t>
-      </w:r>
-      <w:proofErr w:type="spellEnd"/>
-      <w:r>
-        <w:rPr>
-          <w:rFonts w:cstheme="minorHAnsi"/>
-          <w:sz w:val="24"/>
-          <w:szCs w:val="24"/>
-          <w:lang w:val="es-MX"/>
-        </w:rPr>
-        <w:t xml:space="preserve">, a, b, c, f(c)). Si ocurre un </w:t>
-      </w:r>
-      <w:proofErr w:type="spellStart"/>
-      <w:r>
-        <w:rPr>
-          <w:rFonts w:cstheme="minorHAnsi"/>
-          <w:sz w:val="24"/>
-          <w:szCs w:val="24"/>
-          <w:lang w:val="es-MX"/>
-        </w:rPr>
-        <w:t>ValueError</w:t>
-      </w:r>
-      <w:proofErr w:type="spellEnd"/>
-      <w:r>
-        <w:rPr>
-          <w:rFonts w:cstheme="minorHAnsi"/>
-          <w:sz w:val="24"/>
-          <w:szCs w:val="24"/>
-          <w:lang w:val="es-MX"/>
-        </w:rPr>
-        <w:t xml:space="preserve"> (por ejemplo, por falta de cambio de signo), lo captura y muestra el mensaje de error. Esta función conecta la entrada del usuario con la lógica matemática y presenta los resultados de forma clara.</w:t>
+        <w:t>lim_izq &lt; lim_der</w:t>
+      </w:r>
+      <w:r>
+        <w:rPr>
+          <w:rFonts w:cstheme="minorHAnsi"/>
+          <w:sz w:val="24"/>
+          <w:szCs w:val="24"/>
+          <w:lang w:val="es-MX"/>
+        </w:rPr>
+        <w:t>. Luego llama a la función biseccion y, si no hay errores, muestra la raíz encontrada, el número de iteraciones y una tabla formateada con el historial de iteraciones (columnas: Iter, a, b, c, f(c)). Si ocurre un ValueError (por ejemplo, por falta de cambio de signo), lo captura y muestra el mensaje de error. Esta función conecta la entrada del usuario con la lógica matemática y presenta los resultados de forma clara.</w:t>
       </w:r>
     </w:p>
     <w:p>
@@ -2146,7 +1441,6 @@
           <w:lang w:val="es-MX"/>
         </w:rPr>
       </w:pPr>
-      <w:proofErr w:type="spellStart"/>
       <w:r>
         <w:rPr>
           <w:rFonts w:cstheme="minorHAnsi"/>
@@ -2156,91 +1450,7 @@
           <w:szCs w:val="24"/>
           <w:lang w:val="es-MX"/>
         </w:rPr>
-        <w:t>leer_opcion</w:t>
-      </w:r>
-      <w:proofErr w:type="spellEnd"/>
-      <w:r>
-        <w:rPr>
-          <w:rFonts w:cstheme="minorHAnsi"/>
-          <w:i/>
-          <w:iCs/>
-          <w:sz w:val="24"/>
-          <w:szCs w:val="24"/>
-          <w:lang w:val="es-MX"/>
-        </w:rPr>
-        <w:t>(</w:t>
-      </w:r>
-      <w:proofErr w:type="spellStart"/>
-      <w:r>
-        <w:rPr>
-          <w:rFonts w:cstheme="minorHAnsi"/>
-          <w:i/>
-          <w:iCs/>
-          <w:sz w:val="24"/>
-          <w:szCs w:val="24"/>
-          <w:lang w:val="es-MX"/>
-        </w:rPr>
-        <w:t>prompt</w:t>
-      </w:r>
-      <w:proofErr w:type="spellEnd"/>
-      <w:r>
-        <w:rPr>
-          <w:rFonts w:cstheme="minorHAnsi"/>
-          <w:i/>
-          <w:iCs/>
-          <w:sz w:val="24"/>
-          <w:szCs w:val="24"/>
-          <w:lang w:val="es-MX"/>
-        </w:rPr>
-        <w:t xml:space="preserve">, </w:t>
-      </w:r>
-      <w:proofErr w:type="spellStart"/>
-      <w:r>
-        <w:rPr>
-          <w:rFonts w:cstheme="minorHAnsi"/>
-          <w:i/>
-          <w:iCs/>
-          <w:sz w:val="24"/>
-          <w:szCs w:val="24"/>
-          <w:lang w:val="es-MX"/>
-        </w:rPr>
-        <w:t>lower</w:t>
-      </w:r>
-      <w:proofErr w:type="spellEnd"/>
-      <w:r>
-        <w:rPr>
-          <w:rFonts w:cstheme="minorHAnsi"/>
-          <w:i/>
-          <w:iCs/>
-          <w:sz w:val="24"/>
-          <w:szCs w:val="24"/>
-          <w:lang w:val="es-MX"/>
-        </w:rPr>
-        <w:t xml:space="preserve">, </w:t>
-      </w:r>
-      <w:proofErr w:type="spellStart"/>
-      <w:r>
-        <w:rPr>
-          <w:rFonts w:cstheme="minorHAnsi"/>
-          <w:i/>
-          <w:iCs/>
-          <w:sz w:val="24"/>
-          <w:szCs w:val="24"/>
-          <w:lang w:val="es-MX"/>
-        </w:rPr>
-        <w:t>upper</w:t>
-      </w:r>
-      <w:proofErr w:type="spellEnd"/>
-      <w:r>
-        <w:rPr>
-          <w:rFonts w:cstheme="minorHAnsi"/>
-          <w:i/>
-          <w:iCs/>
-          <w:sz w:val="24"/>
-          <w:szCs w:val="24"/>
-          <w:lang w:val="es-MX"/>
-        </w:rPr>
-        <w:t>): lee un entero dentro de un rango cerrado, repitiendo si hay error.</w:t>
+        <w:t>leer_opcion(prompt, lower, upper): lee un entero dentro de un rango cerrado, repitiendo si hay error.</w:t>
       </w:r>
     </w:p>
     <w:p>
@@ -2316,7 +1526,6 @@
           <w:lang w:val="es-MX"/>
         </w:rPr>
       </w:pPr>
-      <w:proofErr w:type="spellStart"/>
       <w:r>
         <w:rPr>
           <w:rFonts w:cstheme="minorHAnsi"/>
@@ -2326,43 +1535,7 @@
           <w:szCs w:val="24"/>
           <w:lang w:val="es-MX"/>
         </w:rPr>
-        <w:t>leer_entero</w:t>
-      </w:r>
-      <w:proofErr w:type="spellEnd"/>
-      <w:r>
-        <w:rPr>
-          <w:rFonts w:cstheme="minorHAnsi"/>
-          <w:i/>
-          <w:iCs/>
-          <w:sz w:val="24"/>
-          <w:szCs w:val="24"/>
-          <w:lang w:val="es-MX"/>
-        </w:rPr>
-        <w:t>(</w:t>
-      </w:r>
-      <w:proofErr w:type="spellStart"/>
-      <w:r>
-        <w:rPr>
-          <w:rFonts w:cstheme="minorHAnsi"/>
-          <w:i/>
-          <w:iCs/>
-          <w:sz w:val="24"/>
-          <w:szCs w:val="24"/>
-          <w:lang w:val="es-MX"/>
-        </w:rPr>
-        <w:t>prompt</w:t>
-      </w:r>
-      <w:proofErr w:type="spellEnd"/>
-      <w:r>
-        <w:rPr>
-          <w:rFonts w:cstheme="minorHAnsi"/>
-          <w:i/>
-          <w:iCs/>
-          <w:sz w:val="24"/>
-          <w:szCs w:val="24"/>
-          <w:lang w:val="es-MX"/>
-        </w:rPr>
-        <w:t>): lee un entero cualquiera.</w:t>
+        <w:t>leer_entero(prompt): lee un entero cualquiera.</w:t>
       </w:r>
     </w:p>
     <w:p>
@@ -2438,7 +1611,6 @@
           <w:lang w:val="es-MX"/>
         </w:rPr>
       </w:pPr>
-      <w:proofErr w:type="spellStart"/>
       <w:r>
         <w:rPr>
           <w:rFonts w:cstheme="minorHAnsi"/>
@@ -2448,67 +1620,7 @@
           <w:szCs w:val="24"/>
           <w:lang w:val="es-MX"/>
         </w:rPr>
-        <w:t>leer_real</w:t>
-      </w:r>
-      <w:proofErr w:type="spellEnd"/>
-      <w:r>
-        <w:rPr>
-          <w:rFonts w:cstheme="minorHAnsi"/>
-          <w:i/>
-          <w:iCs/>
-          <w:sz w:val="24"/>
-          <w:szCs w:val="24"/>
-          <w:lang w:val="es-MX"/>
-        </w:rPr>
-        <w:t>(</w:t>
-      </w:r>
-      <w:proofErr w:type="spellStart"/>
-      <w:r>
-        <w:rPr>
-          <w:rFonts w:cstheme="minorHAnsi"/>
-          <w:i/>
-          <w:iCs/>
-          <w:sz w:val="24"/>
-          <w:szCs w:val="24"/>
-          <w:lang w:val="es-MX"/>
-        </w:rPr>
-        <w:t>prompt</w:t>
-      </w:r>
-      <w:proofErr w:type="spellEnd"/>
-      <w:r>
-        <w:rPr>
-          <w:rFonts w:cstheme="minorHAnsi"/>
-          <w:i/>
-          <w:iCs/>
-          <w:sz w:val="24"/>
-          <w:szCs w:val="24"/>
-          <w:lang w:val="es-MX"/>
-        </w:rPr>
-        <w:t>): lee un número real (</w:t>
-      </w:r>
-      <w:proofErr w:type="spellStart"/>
-      <w:r>
-        <w:rPr>
-          <w:rFonts w:cstheme="minorHAnsi"/>
-          <w:i/>
-          <w:iCs/>
-          <w:sz w:val="24"/>
-          <w:szCs w:val="24"/>
-          <w:lang w:val="es-MX"/>
-        </w:rPr>
-        <w:t>float</w:t>
-      </w:r>
-      <w:proofErr w:type="spellEnd"/>
-      <w:r>
-        <w:rPr>
-          <w:rFonts w:cstheme="minorHAnsi"/>
-          <w:i/>
-          <w:iCs/>
-          <w:sz w:val="24"/>
-          <w:szCs w:val="24"/>
-          <w:lang w:val="es-MX"/>
-        </w:rPr>
-        <w:t>), repitiendo si hay error.</w:t>
+        <w:t>leer_real(prompt): lee un número real (float), repitiendo si hay error.</w:t>
       </w:r>
     </w:p>
     <w:p>
@@ -2585,7 +1697,6 @@
           <w:lang w:val="es-MX"/>
         </w:rPr>
       </w:pPr>
-      <w:proofErr w:type="spellStart"/>
       <w:r>
         <w:rPr>
           <w:rFonts w:cstheme="minorHAnsi"/>
@@ -2595,91 +1706,7 @@
           <w:szCs w:val="24"/>
           <w:lang w:val="es-MX"/>
         </w:rPr>
-        <w:t>borrar_consola</w:t>
-      </w:r>
-      <w:proofErr w:type="spellEnd"/>
-      <w:r>
-        <w:rPr>
-          <w:rFonts w:cstheme="minorHAnsi"/>
-          <w:i/>
-          <w:iCs/>
-          <w:sz w:val="24"/>
-          <w:szCs w:val="24"/>
-          <w:lang w:val="es-MX"/>
-        </w:rPr>
-        <w:t xml:space="preserve">(): limpia la pantalla según el sistema operativo (Windows: </w:t>
-      </w:r>
-      <w:proofErr w:type="spellStart"/>
-      <w:r>
-        <w:rPr>
-          <w:rFonts w:cstheme="minorHAnsi"/>
-          <w:i/>
-          <w:iCs/>
-          <w:sz w:val="24"/>
-          <w:szCs w:val="24"/>
-          <w:lang w:val="es-MX"/>
-        </w:rPr>
-        <w:t>cls</w:t>
-      </w:r>
-      <w:proofErr w:type="spellEnd"/>
-      <w:r>
-        <w:rPr>
-          <w:rFonts w:cstheme="minorHAnsi"/>
-          <w:i/>
-          <w:iCs/>
-          <w:sz w:val="24"/>
-          <w:szCs w:val="24"/>
-          <w:lang w:val="es-MX"/>
-        </w:rPr>
-        <w:t xml:space="preserve">, otros: </w:t>
-      </w:r>
-      <w:proofErr w:type="spellStart"/>
-      <w:r>
-        <w:rPr>
-          <w:rFonts w:cstheme="minorHAnsi"/>
-          <w:i/>
-          <w:iCs/>
-          <w:sz w:val="24"/>
-          <w:szCs w:val="24"/>
-          <w:lang w:val="es-MX"/>
-        </w:rPr>
-        <w:t>clear</w:t>
-      </w:r>
-      <w:proofErr w:type="spellEnd"/>
-      <w:r>
-        <w:rPr>
-          <w:rFonts w:cstheme="minorHAnsi"/>
-          <w:i/>
-          <w:iCs/>
-          <w:sz w:val="24"/>
-          <w:szCs w:val="24"/>
-          <w:lang w:val="es-MX"/>
-        </w:rPr>
-        <w:t>), pero solo si la entrada es una terminal interactiva (</w:t>
-      </w:r>
-      <w:proofErr w:type="spellStart"/>
-      <w:r>
-        <w:rPr>
-          <w:rFonts w:cstheme="minorHAnsi"/>
-          <w:i/>
-          <w:iCs/>
-          <w:sz w:val="24"/>
-          <w:szCs w:val="24"/>
-          <w:lang w:val="es-MX"/>
-        </w:rPr>
-        <w:t>sys.stdin.isatty</w:t>
-      </w:r>
-      <w:proofErr w:type="spellEnd"/>
-      <w:r>
-        <w:rPr>
-          <w:rFonts w:cstheme="minorHAnsi"/>
-          <w:i/>
-          <w:iCs/>
-          <w:sz w:val="24"/>
-          <w:szCs w:val="24"/>
-          <w:lang w:val="es-MX"/>
-        </w:rPr>
-        <w:t>()).</w:t>
+        <w:t>borrar_consola(): limpia la pantalla según el sistema operativo (Windows: cls, otros: clear), pero solo si la entrada es una terminal interactiva (sys.stdin.isatty()).</w:t>
       </w:r>
     </w:p>
     <w:p>
@@ -2920,27 +1947,7 @@
           <w:szCs w:val="24"/>
           <w:lang w:val="es-MX"/>
         </w:rPr>
-        <w:t xml:space="preserve">main.py (o el script de ejecución) llama a run() del módulo </w:t>
-      </w:r>
-      <w:proofErr w:type="spellStart"/>
-      <w:r>
-        <w:rPr>
-          <w:rFonts w:cstheme="minorHAnsi"/>
-          <w:sz w:val="24"/>
-          <w:szCs w:val="24"/>
-          <w:lang w:val="es-MX"/>
-        </w:rPr>
-        <w:t>menu</w:t>
-      </w:r>
-      <w:proofErr w:type="spellEnd"/>
-      <w:r>
-        <w:rPr>
-          <w:rFonts w:cstheme="minorHAnsi"/>
-          <w:sz w:val="24"/>
-          <w:szCs w:val="24"/>
-          <w:lang w:val="es-MX"/>
-        </w:rPr>
-        <w:t>.</w:t>
+        <w:t>main.py (o el script de ejecución) llama a run() del módulo menu.</w:t>
       </w:r>
     </w:p>
     <w:p>
@@ -2964,47 +1971,7 @@
           <w:szCs w:val="24"/>
           <w:lang w:val="es-MX"/>
         </w:rPr>
-        <w:t xml:space="preserve">run() muestra el menú y, si se elige la opción 1, llama a </w:t>
-      </w:r>
-      <w:proofErr w:type="spellStart"/>
-      <w:r>
-        <w:rPr>
-          <w:rFonts w:cstheme="minorHAnsi"/>
-          <w:sz w:val="24"/>
-          <w:szCs w:val="24"/>
-          <w:lang w:val="es-MX"/>
-        </w:rPr>
-        <w:t>ejecutar_biseccion</w:t>
-      </w:r>
-      <w:proofErr w:type="spellEnd"/>
-      <w:r>
-        <w:rPr>
-          <w:rFonts w:cstheme="minorHAnsi"/>
-          <w:sz w:val="24"/>
-          <w:szCs w:val="24"/>
-          <w:lang w:val="es-MX"/>
-        </w:rPr>
-        <w:t xml:space="preserve">() del módulo </w:t>
-      </w:r>
-      <w:proofErr w:type="spellStart"/>
-      <w:r>
-        <w:rPr>
-          <w:rFonts w:cstheme="minorHAnsi"/>
-          <w:sz w:val="24"/>
-          <w:szCs w:val="24"/>
-          <w:lang w:val="es-MX"/>
-        </w:rPr>
-        <w:t>biseccion</w:t>
-      </w:r>
-      <w:proofErr w:type="spellEnd"/>
-      <w:r>
-        <w:rPr>
-          <w:rFonts w:cstheme="minorHAnsi"/>
-          <w:sz w:val="24"/>
-          <w:szCs w:val="24"/>
-          <w:lang w:val="es-MX"/>
-        </w:rPr>
-        <w:t>.</w:t>
+        <w:t>run() muestra el menú y, si se elige la opción 1, llama a ejecutar_biseccion() del módulo biseccion.</w:t>
       </w:r>
     </w:p>
     <w:p>
@@ -3021,85 +1988,14 @@
           <w:lang w:val="es-MX"/>
         </w:rPr>
       </w:pPr>
-      <w:proofErr w:type="spellStart"/>
-      <w:r>
-        <w:rPr>
-          <w:rFonts w:cstheme="minorHAnsi"/>
-          <w:sz w:val="24"/>
-          <w:szCs w:val="24"/>
-          <w:lang w:val="es-MX"/>
-        </w:rPr>
-        <w:t>ejecutar_biseccion</w:t>
-      </w:r>
-      <w:proofErr w:type="spellEnd"/>
-      <w:r>
-        <w:rPr>
-          <w:rFonts w:cstheme="minorHAnsi"/>
-          <w:sz w:val="24"/>
-          <w:szCs w:val="24"/>
-          <w:lang w:val="es-MX"/>
-        </w:rPr>
-        <w:t xml:space="preserve">() solicita los datos al usuario usando </w:t>
-      </w:r>
-      <w:proofErr w:type="spellStart"/>
-      <w:r>
-        <w:rPr>
-          <w:rFonts w:cstheme="minorHAnsi"/>
-          <w:sz w:val="24"/>
-          <w:szCs w:val="24"/>
-          <w:lang w:val="es-MX"/>
-        </w:rPr>
-        <w:t>leer_real</w:t>
-      </w:r>
-      <w:proofErr w:type="spellEnd"/>
-      <w:r>
-        <w:rPr>
-          <w:rFonts w:cstheme="minorHAnsi"/>
-          <w:sz w:val="24"/>
-          <w:szCs w:val="24"/>
-          <w:lang w:val="es-MX"/>
-        </w:rPr>
-        <w:t xml:space="preserve"> de </w:t>
-      </w:r>
-      <w:proofErr w:type="spellStart"/>
-      <w:r>
-        <w:rPr>
-          <w:rFonts w:cstheme="minorHAnsi"/>
-          <w:sz w:val="24"/>
-          <w:szCs w:val="24"/>
-          <w:lang w:val="es-MX"/>
-        </w:rPr>
-        <w:t>utils</w:t>
-      </w:r>
-      <w:proofErr w:type="spellEnd"/>
-      <w:r>
-        <w:rPr>
-          <w:rFonts w:cstheme="minorHAnsi"/>
-          <w:sz w:val="24"/>
-          <w:szCs w:val="24"/>
-          <w:lang w:val="es-MX"/>
-        </w:rPr>
-        <w:t xml:space="preserve">, valida los coeficientes y el intervalo, y llama a </w:t>
-      </w:r>
-      <w:proofErr w:type="spellStart"/>
-      <w:r>
-        <w:rPr>
-          <w:rFonts w:cstheme="minorHAnsi"/>
-          <w:sz w:val="24"/>
-          <w:szCs w:val="24"/>
-          <w:lang w:val="es-MX"/>
-        </w:rPr>
-        <w:t>biseccion</w:t>
-      </w:r>
-      <w:proofErr w:type="spellEnd"/>
-      <w:r>
-        <w:rPr>
-          <w:rFonts w:cstheme="minorHAnsi"/>
-          <w:sz w:val="24"/>
-          <w:szCs w:val="24"/>
-          <w:lang w:val="es-MX"/>
-        </w:rPr>
-        <w:t>().</w:t>
+      <w:r>
+        <w:rPr>
+          <w:rFonts w:cstheme="minorHAnsi"/>
+          <w:sz w:val="24"/>
+          <w:szCs w:val="24"/>
+          <w:lang w:val="es-MX"/>
+        </w:rPr>
+        <w:t>ejecutar_biseccion() solicita los datos al usuario usando leer_real de utils, valida los coeficientes y el intervalo, y llama a biseccion().</w:t>
       </w:r>
     </w:p>
     <w:p>
@@ -3116,7 +2012,6 @@
           <w:lang w:val="es-MX"/>
         </w:rPr>
       </w:pPr>
-      <w:proofErr w:type="spellStart"/>
       <w:r>
         <w:rPr>
           <w:rFonts w:cstheme="minorHAnsi"/>
@@ -3125,37 +2020,7 @@
           <w:lang w:val="es-MX"/>
         </w:rPr>
         <w:lastRenderedPageBreak/>
-        <w:t>biseccion</w:t>
-      </w:r>
-      <w:proofErr w:type="spellEnd"/>
-      <w:r>
-        <w:rPr>
-          <w:rFonts w:cstheme="minorHAnsi"/>
-          <w:sz w:val="24"/>
-          <w:szCs w:val="24"/>
-          <w:lang w:val="es-MX"/>
-        </w:rPr>
-        <w:t xml:space="preserve">() utiliza </w:t>
-      </w:r>
-      <w:proofErr w:type="spellStart"/>
-      <w:r>
-        <w:rPr>
-          <w:rFonts w:cstheme="minorHAnsi"/>
-          <w:sz w:val="24"/>
-          <w:szCs w:val="24"/>
-          <w:lang w:val="es-MX"/>
-        </w:rPr>
-        <w:t>evaluar_polimonio</w:t>
-      </w:r>
-      <w:proofErr w:type="spellEnd"/>
-      <w:r>
-        <w:rPr>
-          <w:rFonts w:cstheme="minorHAnsi"/>
-          <w:sz w:val="24"/>
-          <w:szCs w:val="24"/>
-          <w:lang w:val="es-MX"/>
-        </w:rPr>
-        <w:t>() para calcular los valores de f y ejecuta el algoritmo, devolviendo la raíz, el número de iteraciones y el historial.</w:t>
+        <w:t>biseccion() utiliza evaluar_polimonio() para calcular los valores de f y ejecuta el algoritmo, devolviendo la raíz, el número de iteraciones y el historial.</w:t>
       </w:r>
     </w:p>
     <w:p>
@@ -3172,25 +2037,14 @@
           <w:lang w:val="es-MX"/>
         </w:rPr>
       </w:pPr>
-      <w:proofErr w:type="spellStart"/>
-      <w:r>
-        <w:rPr>
-          <w:rFonts w:cstheme="minorHAnsi"/>
-          <w:sz w:val="24"/>
-          <w:szCs w:val="24"/>
-          <w:lang w:val="es-MX"/>
-        </w:rPr>
-        <w:t>ejecutar_biseccion</w:t>
-      </w:r>
-      <w:proofErr w:type="spellEnd"/>
-      <w:r>
-        <w:rPr>
-          <w:rFonts w:cstheme="minorHAnsi"/>
-          <w:sz w:val="24"/>
-          <w:szCs w:val="24"/>
-          <w:lang w:val="es-MX"/>
-        </w:rPr>
-        <w:t>() muestra los resultados y la tabla de iteraciones.</w:t>
+      <w:r>
+        <w:rPr>
+          <w:rFonts w:cstheme="minorHAnsi"/>
+          <w:sz w:val="24"/>
+          <w:szCs w:val="24"/>
+          <w:lang w:val="es-MX"/>
+        </w:rPr>
+        <w:t>ejecutar_biseccion() muestra los resultados y la tabla de iteraciones.</w:t>
       </w:r>
     </w:p>
     <w:p>
@@ -3848,7 +2702,7 @@
           <w:lang w:val="es-MX"/>
         </w:rPr>
         <w:drawing>
-          <wp:inline distT="0" distB="0" distL="0" distR="0" wp14:anchorId="3CAF38CF" wp14:editId="535EA3B4">
+          <wp:inline distT="0" distB="0" distL="0" distR="0" wp14:anchorId="3CAF38CF" wp14:editId="7764861F">
             <wp:extent cx="7768988" cy="5876541"/>
             <wp:effectExtent l="0" t="6350" r="0" b="0"/>
             <wp:docPr id="1851324940" name="Imagen 12"/>
@@ -4041,7 +2895,7 @@
           <w:lang w:val="es-MX"/>
         </w:rPr>
         <w:drawing>
-          <wp:inline distT="0" distB="0" distL="0" distR="0" wp14:anchorId="14B09CF6" wp14:editId="502916DB">
+          <wp:inline distT="0" distB="0" distL="0" distR="0" wp14:anchorId="14B09CF6" wp14:editId="338B05A6">
             <wp:extent cx="5092995" cy="7914296"/>
             <wp:effectExtent l="0" t="0" r="0" b="0"/>
             <wp:docPr id="845902517" name="Imagen 13"/>
@@ -4281,13 +3135,13 @@
       </w:pPr>
       <w:r>
         <w:rPr>
-          <w:noProof/>
+          <w:lang w:val="es-MX"/>
         </w:rPr>
         <w:drawing>
-          <wp:inline distT="0" distB="0" distL="0" distR="0" wp14:anchorId="6DE4661D" wp14:editId="6E2E5B59">
-            <wp:extent cx="4944110" cy="4429760"/>
-            <wp:effectExtent l="0" t="0" r="0" b="0"/>
-            <wp:docPr id="26" name="Image10"/>
+          <wp:inline distT="0" distB="0" distL="0" distR="0" wp14:anchorId="5A1891B4" wp14:editId="3F622750">
+            <wp:extent cx="5943600" cy="4869180"/>
+            <wp:effectExtent l="0" t="0" r="0" b="7620"/>
+            <wp:docPr id="1460439336" name="Imagen 1"/>
             <wp:cNvGraphicFramePr>
               <a:graphicFrameLocks xmlns:a="http://schemas.openxmlformats.org/drawingml/2006/main" noChangeAspect="1"/>
             </wp:cNvGraphicFramePr>
@@ -4295,10 +3149,8 @@
               <a:graphicData uri="http://schemas.openxmlformats.org/drawingml/2006/picture">
                 <pic:pic xmlns:pic="http://schemas.openxmlformats.org/drawingml/2006/picture">
                   <pic:nvPicPr>
-                    <pic:cNvPr id="26" name="Image10"/>
-                    <pic:cNvPicPr>
-                      <a:picLocks noChangeAspect="1" noChangeArrowheads="1"/>
-                    </pic:cNvPicPr>
+                    <pic:cNvPr id="1460439336" name=""/>
+                    <pic:cNvPicPr/>
                   </pic:nvPicPr>
                   <pic:blipFill>
                     <a:blip r:embed="rId21"/>
@@ -4306,15 +3158,14 @@
                       <a:fillRect/>
                     </a:stretch>
                   </pic:blipFill>
-                  <pic:spPr bwMode="auto">
+                  <pic:spPr>
                     <a:xfrm>
                       <a:off x="0" y="0"/>
-                      <a:ext cx="4944110" cy="4429760"/>
+                      <a:ext cx="5943600" cy="4869180"/>
                     </a:xfrm>
                     <a:prstGeom prst="rect">
                       <a:avLst/>
                     </a:prstGeom>
-                    <a:noFill/>
                   </pic:spPr>
                 </pic:pic>
               </a:graphicData>

</xml_diff>